<commit_message>
Rewrite interview guide after review for Task 1
Две правки по замечаниям преподавателя.

Убраны разрывы страницы между разделами, хотя свод правил оформления их
требует: отчёт небольшой, и из-за разрывов он расползался на полупустые
страницы. Вместо разрыва одна пустая строка.

Все 41 пункт гайда переписаны тезисно. Документ должен читаться как план тем,
а не как список готовых реплик, поэтому убраны первое и второе лицо, глаголы
«расскажите», «опишите», «покажите» и знаки вопроса. Типы вопросов рядом с
пунктами оставлены. В начало третьего раздела добавлено пояснение, почему
формулировки именно такие.
</commit_message>
<xml_diff>
--- a/Task 1st Deep Interview Guide/Solution/Отчёт по ПР №1.docx
+++ b/Task 1st Deep Interview Guide/Solution/Отчёт по ПР №1.docx
@@ -36,6 +36,13 @@
         <w:ind w:firstLine="850"/>
         <w:jc w:val="both"/>
       </w:pPr>
+    </w:p>
+    <w:p>
+      <w:pPr>
+        <w:spacing w:line="240" w:lineRule="auto" w:before="0" w:after="0"/>
+        <w:ind w:firstLine="850"/>
+        <w:jc w:val="both"/>
+      </w:pPr>
       <w:r>
         <w:rPr>
           <w:rFonts w:ascii="Times New Roman" w:hAnsi="Times New Roman"/>
@@ -92,9 +99,6 @@
         <w:ind w:firstLine="850"/>
         <w:jc w:val="both"/>
       </w:pPr>
-      <w:r>
-        <w:br w:type="page"/>
-      </w:r>
     </w:p>
     <w:p>
       <w:pPr>
@@ -256,9 +260,6 @@
         <w:ind w:firstLine="850"/>
         <w:jc w:val="both"/>
       </w:pPr>
-      <w:r>
-        <w:br w:type="page"/>
-      </w:r>
     </w:p>
     <w:p>
       <w:pPr>
@@ -272,6 +273,48 @@
           <w:sz w:val="28"/>
         </w:rPr>
         <w:t>3 Составленный гайд</w:t>
+      </w:r>
+    </w:p>
+    <w:p>
+      <w:pPr>
+        <w:spacing w:line="240" w:lineRule="auto" w:before="0" w:after="0"/>
+        <w:ind w:firstLine="850"/>
+        <w:jc w:val="both"/>
+      </w:pPr>
+    </w:p>
+    <w:p>
+      <w:pPr>
+        <w:spacing w:line="240" w:lineRule="auto" w:before="0" w:after="0"/>
+        <w:ind w:firstLine="850"/>
+        <w:jc w:val="both"/>
+      </w:pPr>
+    </w:p>
+    <w:p>
+      <w:pPr>
+        <w:spacing w:line="240" w:lineRule="auto" w:before="0" w:after="0"/>
+        <w:ind w:firstLine="850"/>
+        <w:jc w:val="both"/>
+      </w:pPr>
+      <w:r>
+        <w:rPr>
+          <w:rFonts w:ascii="Times New Roman" w:hAnsi="Times New Roman"/>
+          <w:sz w:val="28"/>
+        </w:rPr>
+        <w:t>Пункты внутри блоков записаны тезисами, а не готовыми репликами. Гайд это план беседы: он задаёт темы и порядок, а точную формулировку интервьюер подбирает на месте, под ответ собеседника и под его лексику. Жёстко заученный текст мешает слушать и превращает глубинное интервью в анкету.</w:t>
+      </w:r>
+    </w:p>
+    <w:p>
+      <w:pPr>
+        <w:spacing w:line="240" w:lineRule="auto" w:before="0" w:after="0"/>
+        <w:ind w:firstLine="850"/>
+        <w:jc w:val="both"/>
+      </w:pPr>
+      <w:r>
+        <w:rPr>
+          <w:rFonts w:ascii="Times New Roman" w:hAnsi="Times New Roman"/>
+          <w:sz w:val="28"/>
+        </w:rPr>
+        <w:t>Рядом с каждым пунктом указан тип вопроса, которым тема раскрывается: открытый, закрытый, ситуационный, проблемный, зондирующий или уточняющий. Тип определяет, какой ответ ожидается, и подсказывает формулировку в момент разговора.</w:t>
       </w:r>
     </w:p>
     <w:p>
@@ -1928,7 +1971,7 @@
           <w:rFonts w:ascii="Times New Roman" w:hAnsi="Times New Roman"/>
           <w:sz w:val="28"/>
         </w:rPr>
-        <w:t>1 Расскажите, чем сейчас занимается компания и как устроены продажи? (открытый, ситуационный)</w:t>
+        <w:t>1 Чем занимается компания сейчас и как устроены продажи (открытый, ситуационный)</w:t>
       </w:r>
     </w:p>
     <w:p>
@@ -1942,7 +1985,7 @@
           <w:rFonts w:ascii="Times New Roman" w:hAnsi="Times New Roman"/>
           <w:sz w:val="28"/>
         </w:rPr>
-        <w:t>2 Как клиенты находят вас сегодня и как доходят до покупки? (открытый, ситуационный)</w:t>
+        <w:t>2 Как клиенты находят компанию сегодня и доходят до покупки (открытый, ситуационный)</w:t>
       </w:r>
     </w:p>
     <w:p>
@@ -1956,7 +1999,7 @@
           <w:rFonts w:ascii="Times New Roman" w:hAnsi="Times New Roman"/>
           <w:sz w:val="28"/>
         </w:rPr>
-        <w:t>3 Что подтолкнуло вас к запуску интернет-магазина именно сейчас? (открытый, проблемный)</w:t>
+        <w:t>3 Что подтолкнуло к запуску интернет-магазина именно сейчас (открытый, проблемный)</w:t>
       </w:r>
     </w:p>
     <w:p>
@@ -1970,7 +2013,7 @@
           <w:rFonts w:ascii="Times New Roman" w:hAnsi="Times New Roman"/>
           <w:sz w:val="28"/>
         </w:rPr>
-        <w:t>4 Какую задачу магазин должен решить в первую очередь: привести новых покупателей, разгрузить продавцов, поднять средний чек? (открытый)</w:t>
+        <w:t>4 Главная задача магазина: новые покупатели, разгрузка продавцов или средний чек (открытый)</w:t>
       </w:r>
     </w:p>
     <w:p>
@@ -1984,7 +2027,7 @@
           <w:rFonts w:ascii="Times New Roman" w:hAnsi="Times New Roman"/>
           <w:sz w:val="28"/>
         </w:rPr>
-        <w:t>5 По какому показателю через полгода после запуска вы поймёте, что проект удался? (открытый, зондирующий)</w:t>
+        <w:t>5 Показатель, по которому через полгода будет понятно, что проект удался (открытый, зондирующий)</w:t>
       </w:r>
     </w:p>
     <w:p>
@@ -1998,7 +2041,7 @@
           <w:rFonts w:ascii="Times New Roman" w:hAnsi="Times New Roman"/>
           <w:sz w:val="28"/>
         </w:rPr>
-        <w:t>6 Какой у проекта бюджет и есть ли дата, к которой магазин должен работать? (открытый)</w:t>
+        <w:t>6 Бюджет проекта и дата, к которой магазин должен работать (открытый)</w:t>
       </w:r>
     </w:p>
     <w:p>
@@ -2012,7 +2055,7 @@
           <w:rFonts w:ascii="Times New Roman" w:hAnsi="Times New Roman"/>
           <w:sz w:val="28"/>
         </w:rPr>
-        <w:t>7 Верно ли, что на первом этапе доставка планируется только по городу? (закрытый, уточняющий)</w:t>
+        <w:t>7 Подтверждение: на первом этапе доставка только по городу (закрытый, уточняющий)</w:t>
       </w:r>
     </w:p>
     <w:p>
@@ -2103,7 +2146,7 @@
           <w:rFonts w:ascii="Times New Roman" w:hAnsi="Times New Roman"/>
           <w:sz w:val="28"/>
         </w:rPr>
-        <w:t>1 Какие разделы обязательно должны быть на сайте? (открытый)</w:t>
+        <w:t>1 Обязательные разделы сайта (открытый)</w:t>
       </w:r>
     </w:p>
     <w:p>
@@ -2117,7 +2160,7 @@
           <w:rFonts w:ascii="Times New Roman" w:hAnsi="Times New Roman"/>
           <w:sz w:val="28"/>
         </w:rPr>
-        <w:t>2 Опишите путь покупателя от входа на сайт до оплаты так, как вы его видите. (открытый)</w:t>
+        <w:t>2 Путь покупателя от входа на сайт до оплаты глазами заказчика (открытый)</w:t>
       </w:r>
     </w:p>
     <w:p>
@@ -2131,7 +2174,7 @@
           <w:rFonts w:ascii="Times New Roman" w:hAnsi="Times New Roman"/>
           <w:sz w:val="28"/>
         </w:rPr>
-        <w:t>3 Какими способами покупатель должен оплачивать заказ? (открытый)</w:t>
+        <w:t>3 Способы оплаты заказа (открытый)</w:t>
       </w:r>
     </w:p>
     <w:p>
@@ -2145,7 +2188,7 @@
           <w:rFonts w:ascii="Times New Roman" w:hAnsi="Times New Roman"/>
           <w:sz w:val="28"/>
         </w:rPr>
-        <w:t>4 Нужен ли личный кабинет с историей заказов? (закрытый)</w:t>
+        <w:t>4 Необходимость личного кабинета с историей заказов (закрытый)</w:t>
       </w:r>
     </w:p>
     <w:p>
@@ -2159,7 +2202,7 @@
           <w:rFonts w:ascii="Times New Roman" w:hAnsi="Times New Roman"/>
           <w:sz w:val="28"/>
         </w:rPr>
-        <w:t>5 Как покупатель подбирает размер, есть ли у вас размерная сетка? (открытый, ситуационный)</w:t>
+        <w:t>5 Как подбирается размер, есть ли размерная сетка (открытый, ситуационный)</w:t>
       </w:r>
     </w:p>
     <w:p>
@@ -2173,7 +2216,7 @@
           <w:rFonts w:ascii="Times New Roman" w:hAnsi="Times New Roman"/>
           <w:sz w:val="28"/>
         </w:rPr>
-        <w:t>6 Что должно происходить, когда нужного размера нет в наличии? (проблемный)</w:t>
+        <w:t>6 Поведение сайта, когда нужного размера нет в наличии (проблемный)</w:t>
       </w:r>
     </w:p>
     <w:p>
@@ -2187,7 +2230,7 @@
           <w:rFonts w:ascii="Times New Roman" w:hAnsi="Times New Roman"/>
           <w:sz w:val="28"/>
         </w:rPr>
-        <w:t>7 Покажите сайты, которые вам нравятся, и скажите, что именно в них нравится. (открытый, уточняющий)</w:t>
+        <w:t>7 Сайты-референсы и что именно в них нравится (открытый, уточняющий)</w:t>
       </w:r>
     </w:p>
     <w:p>
@@ -2201,7 +2244,7 @@
           <w:rFonts w:ascii="Times New Roman" w:hAnsi="Times New Roman"/>
           <w:sz w:val="28"/>
         </w:rPr>
-        <w:t>8 Есть ли готовый фирменный стиль: логотип, цвета, шрифты? (закрытый)</w:t>
+        <w:t>8 Наличие фирменного стиля: логотип, цвета, шрифты (закрытый)</w:t>
       </w:r>
     </w:p>
     <w:p>
@@ -2215,7 +2258,7 @@
           <w:rFonts w:ascii="Times New Roman" w:hAnsi="Times New Roman"/>
           <w:sz w:val="28"/>
         </w:rPr>
-        <w:t>9 Что вы вкладываете в слово «современный», когда говорите о дизайне? (уточняющий)</w:t>
+        <w:t>9 Что стоит за словом «современный» в оценке дизайна (уточняющий)</w:t>
       </w:r>
     </w:p>
     <w:p>
@@ -2306,7 +2349,7 @@
           <w:rFonts w:ascii="Times New Roman" w:hAnsi="Times New Roman"/>
           <w:sz w:val="28"/>
         </w:rPr>
-        <w:t>1 С каких устройств чаще всего заходят ваши покупатели? (ситуационный)</w:t>
+        <w:t>1 Устройства, с которых чаще всего заходят покупатели (ситуационный)</w:t>
       </w:r>
     </w:p>
     <w:p>
@@ -2320,7 +2363,7 @@
           <w:rFonts w:ascii="Times New Roman" w:hAnsi="Times New Roman"/>
           <w:sz w:val="28"/>
         </w:rPr>
-        <w:t>2 Кто будет вести каталог со стороны компании и с какого компьютера? (ситуационный)</w:t>
+        <w:t>2 Кто ведёт каталог со стороны компании и на каком оборудовании (ситуационный)</w:t>
       </w:r>
     </w:p>
     <w:p>
@@ -2334,7 +2377,7 @@
           <w:rFonts w:ascii="Times New Roman" w:hAnsi="Times New Roman"/>
           <w:sz w:val="28"/>
         </w:rPr>
-        <w:t>3 Есть ли браузеры, которые обязательно нужно поддержать? (закрытый)</w:t>
+        <w:t>3 Браузеры, которые обязательно поддержать (закрытый)</w:t>
       </w:r>
     </w:p>
     <w:p>
@@ -2348,7 +2391,7 @@
           <w:rFonts w:ascii="Times New Roman" w:hAnsi="Times New Roman"/>
           <w:sz w:val="28"/>
         </w:rPr>
-        <w:t>4 Какую нагрузку вы ждёте в пик, например в день распродажи? (открытый)</w:t>
+        <w:t>4 Ожидаемая нагрузка в пик, например в день распродажи (открытый)</w:t>
       </w:r>
     </w:p>
     <w:p>
@@ -2362,7 +2405,7 @@
           <w:rFonts w:ascii="Times New Roman" w:hAnsi="Times New Roman"/>
           <w:sz w:val="28"/>
         </w:rPr>
-        <w:t>5 Где планируется размещать сайт, есть ли уже хостинг и домен? (открытый)</w:t>
+        <w:t>5 Площадка размещения, наличие хостинга и домена (открытый)</w:t>
       </w:r>
     </w:p>
     <w:p>
@@ -2453,7 +2496,7 @@
           <w:rFonts w:ascii="Times New Roman" w:hAnsi="Times New Roman"/>
           <w:sz w:val="28"/>
         </w:rPr>
-        <w:t>1 Есть ли системы, с которыми магазин обязан обмениваться данными: 1С, складская программа, CRM? (открытый)</w:t>
+        <w:t>1 Системы для обмена данными: 1С, складская программа, CRM (открытый)</w:t>
       </w:r>
     </w:p>
     <w:p>
@@ -2467,7 +2510,7 @@
           <w:rFonts w:ascii="Times New Roman" w:hAnsi="Times New Roman"/>
           <w:sz w:val="28"/>
         </w:rPr>
-        <w:t>2 Какие сторонние сервисы вы готовы подключать: эквайринг, службы доставки, рассылка сообщений? (открытый)</w:t>
+        <w:t>2 Сторонние сервисы к подключению: эквайринг, доставка, рассылки (открытый)</w:t>
       </w:r>
     </w:p>
     <w:p>
@@ -2481,7 +2524,7 @@
           <w:rFonts w:ascii="Times New Roman" w:hAnsi="Times New Roman"/>
           <w:sz w:val="28"/>
         </w:rPr>
-        <w:t>3 Есть ли ограничения на использование зарубежных сервисов и компонентов с открытым исходным кодом? (открытый)</w:t>
+        <w:t>3 Ограничения на зарубежные сервисы и компоненты с открытым исходным кодом (открытый)</w:t>
       </w:r>
     </w:p>
     <w:p>
@@ -2495,7 +2538,7 @@
           <w:rFonts w:ascii="Times New Roman" w:hAnsi="Times New Roman"/>
           <w:sz w:val="28"/>
         </w:rPr>
-        <w:t>4 Кому должны принадлежать исходный код и права на дизайн после сдачи работы? (закрытый)</w:t>
+        <w:t>4 Кому принадлежат исходный код и права на дизайн после сдачи работы (закрытый)</w:t>
       </w:r>
     </w:p>
     <w:p>
@@ -2509,7 +2552,7 @@
           <w:rFonts w:ascii="Times New Roman" w:hAnsi="Times New Roman"/>
           <w:sz w:val="28"/>
         </w:rPr>
-        <w:t>5 Откуда берутся фотографии товаров и есть ли на них права? (уточняющий)</w:t>
+        <w:t>5 Источник фотографий товаров и права на них (уточняющий)</w:t>
       </w:r>
     </w:p>
     <w:p>
@@ -2600,7 +2643,7 @@
           <w:rFonts w:ascii="Times New Roman" w:hAnsi="Times New Roman"/>
           <w:sz w:val="28"/>
         </w:rPr>
-        <w:t>1 Кто ваш типичный покупатель: возраст, род занятий, как принимает решение о покупке? (открытый)</w:t>
+        <w:t>1 Типичный покупатель: возраст, род занятий, как принимает решение о покупке (открытый)</w:t>
       </w:r>
     </w:p>
     <w:p>
@@ -2614,7 +2657,7 @@
           <w:rFonts w:ascii="Times New Roman" w:hAnsi="Times New Roman"/>
           <w:sz w:val="28"/>
         </w:rPr>
-        <w:t>2 Чем тот, кто покупает впервые, отличается от постоянного клиента? (открытый)</w:t>
+        <w:t>2 Отличия покупателя-новичка от постоянного клиента (открытый)</w:t>
       </w:r>
     </w:p>
     <w:p>
@@ -2628,7 +2671,7 @@
           <w:rFonts w:ascii="Times New Roman" w:hAnsi="Times New Roman"/>
           <w:sz w:val="28"/>
         </w:rPr>
-        <w:t>3 Какие роли кроме покупателя будут работать с системой? (открытый)</w:t>
+        <w:t>3 Роли, кроме покупателя, работающие с системой (открытый)</w:t>
       </w:r>
     </w:p>
     <w:p>
@@ -2642,7 +2685,7 @@
           <w:rFonts w:ascii="Times New Roman" w:hAnsi="Times New Roman"/>
           <w:sz w:val="28"/>
         </w:rPr>
-        <w:t>4 Что должен и чего не должен видеть контент-менеджер? (уточняющий)</w:t>
+        <w:t>4 Что должен и чего не должен видеть контент-менеджер (уточняющий)</w:t>
       </w:r>
     </w:p>
     <w:p>
@@ -2656,7 +2699,7 @@
           <w:rFonts w:ascii="Times New Roman" w:hAnsi="Times New Roman"/>
           <w:sz w:val="28"/>
         </w:rPr>
-        <w:t>5 С какими трудностями покупатели чаще всего сталкиваются в офлайн-магазине? (проблемный)</w:t>
+        <w:t>5 Трудности покупателей в офлайн-магазине (проблемный)</w:t>
       </w:r>
     </w:p>
     <w:p>
@@ -2747,7 +2790,7 @@
           <w:rFonts w:ascii="Times New Roman" w:hAnsi="Times New Roman"/>
           <w:sz w:val="28"/>
         </w:rPr>
-        <w:t>1 По каким запросам вас должны находить в поиске? (открытый)</w:t>
+        <w:t>1 Запросы, по которым компанию должны находить в поиске (открытый)</w:t>
       </w:r>
     </w:p>
     <w:p>
@@ -2761,7 +2804,7 @@
           <w:rFonts w:ascii="Times New Roman" w:hAnsi="Times New Roman"/>
           <w:sz w:val="28"/>
         </w:rPr>
-        <w:t>2 Какие каналы продвижения вы уже используете и что из этого работает? (ситуационный)</w:t>
+        <w:t>2 Используемые каналы продвижения и что из них работает (ситуационный)</w:t>
       </w:r>
     </w:p>
     <w:p>
@@ -2775,7 +2818,7 @@
           <w:rFonts w:ascii="Times New Roman" w:hAnsi="Times New Roman"/>
           <w:sz w:val="28"/>
         </w:rPr>
-        <w:t>3 Нужна ли интеграция с системами аналитики и с социальными сетями? (закрытый)</w:t>
+        <w:t>3 Необходимость интеграции с системами аналитики и социальными сетями (закрытый)</w:t>
       </w:r>
     </w:p>
     <w:p>
@@ -2789,7 +2832,7 @@
           <w:rFonts w:ascii="Times New Roman" w:hAnsi="Times New Roman"/>
           <w:sz w:val="28"/>
         </w:rPr>
-        <w:t>4 Планируете ли вы рассылки и промокоды? (закрытый)</w:t>
+        <w:t>4 Планы на рассылки и промокоды (закрытый)</w:t>
       </w:r>
     </w:p>
     <w:p>
@@ -2880,7 +2923,7 @@
           <w:rFonts w:ascii="Times New Roman" w:hAnsi="Times New Roman"/>
           <w:sz w:val="28"/>
         </w:rPr>
-        <w:t>1 Готовы ли вы опрашивать покупателей прямо на сайте после оформления заказа? (закрытый)</w:t>
+        <w:t>1 Готовность опрашивать покупателей на сайте после оформления заказа (закрытый)</w:t>
       </w:r>
     </w:p>
     <w:p>
@@ -2894,7 +2937,7 @@
           <w:rFonts w:ascii="Times New Roman" w:hAnsi="Times New Roman"/>
           <w:sz w:val="28"/>
         </w:rPr>
-        <w:t>2 Каких данных о покупателях вам сейчас не хватает, чтобы принимать решения? (открытый, зондирующий)</w:t>
+        <w:t>2 Каких данных о покупателях не хватает для принятия решений (открытый, зондирующий)</w:t>
       </w:r>
     </w:p>
     <w:p>
@@ -2908,7 +2951,7 @@
           <w:rFonts w:ascii="Times New Roman" w:hAnsi="Times New Roman"/>
           <w:sz w:val="28"/>
         </w:rPr>
-        <w:t>3 Кто со стороны компании будет читать результаты опросов? (закрытый)</w:t>
+        <w:t>3 Кто со стороны компании читает результаты опросов (закрытый)</w:t>
       </w:r>
     </w:p>
     <w:p>
@@ -3301,7 +3344,7 @@
           <w:rFonts w:ascii="Times New Roman" w:hAnsi="Times New Roman"/>
           <w:sz w:val="28"/>
         </w:rPr>
-        <w:t>1 Опишите одним предложением, что должен уметь сделать покупатель, чтобы вы считали магазин работающим? (открытый)</w:t>
+        <w:t>1 Минимум, который должен уметь покупатель, чтобы магазин считался рабочим (открытый)</w:t>
       </w:r>
     </w:p>
     <w:p>
@@ -3315,7 +3358,7 @@
           <w:rFonts w:ascii="Times New Roman" w:hAnsi="Times New Roman"/>
           <w:sz w:val="28"/>
         </w:rPr>
-        <w:t>2 Что из перечисленного обязательно в первой версии, а что можно отложить? (закрытый, приоритизация)</w:t>
+        <w:t>2 Что обязательно в первой версии, а что можно отложить (закрытый, приоритизация)</w:t>
       </w:r>
     </w:p>
     <w:p>
@@ -3329,7 +3372,7 @@
           <w:rFonts w:ascii="Times New Roman" w:hAnsi="Times New Roman"/>
           <w:sz w:val="28"/>
         </w:rPr>
-        <w:t>3 Если бы пришлось выкинуть одну возможность из списка, какую? (зондирующий)</w:t>
+        <w:t>3 Какую возможность убрать первой при сокращении объёма (зондирующий)</w:t>
       </w:r>
     </w:p>
     <w:p>
@@ -4838,9 +4881,6 @@
         <w:ind w:firstLine="850"/>
         <w:jc w:val="both"/>
       </w:pPr>
-      <w:r>
-        <w:br w:type="page"/>
-      </w:r>
     </w:p>
     <w:p>
       <w:pPr>

</xml_diff>